<commit_message>
changing paragraph git push
</commit_message>
<xml_diff>
--- a/chapter1.docx
+++ b/chapter1.docx
@@ -218,7 +218,7 @@
           <w:rFonts w:ascii="Times New Roman" w:eastAsia="Times New Roman" w:hAnsi="Times New Roman" w:cs="Times New Roman"/>
           <w:sz w:val="48"/>
           <w:szCs w:val="48"/>
-          <w:lang w:val="en-US" w:eastAsia="ru-RU"/>
+          <w:lang w:val="kk-KZ" w:eastAsia="ru-RU"/>
         </w:rPr>
       </w:pPr>
       <w:r>
@@ -237,45 +237,7 @@
           <w:szCs w:val="48"/>
           <w:lang w:val="kk-KZ" w:eastAsia="ru-RU"/>
         </w:rPr>
-        <w:t xml:space="preserve"> ЖҰМЫС №</w:t>
-      </w:r>
-      <w:r>
-        <w:rPr>
-          <w:rFonts w:ascii="Times New Roman" w:eastAsia="Times New Roman" w:hAnsi="Times New Roman" w:cs="Times New Roman"/>
-          <w:sz w:val="48"/>
-          <w:szCs w:val="48"/>
-          <w:lang w:val="kk-KZ" w:eastAsia="ru-RU"/>
-        </w:rPr>
-        <w:t>3-4</w:t>
-      </w:r>
-      <w:r>
-        <w:rPr>
-          <w:rFonts w:ascii="Times New Roman" w:eastAsia="Times New Roman" w:hAnsi="Times New Roman" w:cs="Times New Roman"/>
-          <w:sz w:val="48"/>
-          <w:szCs w:val="48"/>
-          <w:lang w:val="kk-KZ" w:eastAsia="ru-RU"/>
-        </w:rPr>
-        <w:t xml:space="preserve"> </w:t>
-      </w:r>
-      <w:proofErr w:type="spellStart"/>
-      <w:r>
-        <w:rPr>
-          <w:rFonts w:ascii="Times New Roman" w:eastAsia="Times New Roman" w:hAnsi="Times New Roman" w:cs="Times New Roman"/>
-          <w:sz w:val="48"/>
-          <w:szCs w:val="48"/>
-          <w:lang w:val="en-US" w:eastAsia="ru-RU"/>
-        </w:rPr>
-        <w:t>kek</w:t>
-      </w:r>
-      <w:proofErr w:type="spellEnd"/>
-      <w:r>
-        <w:rPr>
-          <w:rFonts w:ascii="Times New Roman" w:eastAsia="Times New Roman" w:hAnsi="Times New Roman" w:cs="Times New Roman"/>
-          <w:sz w:val="48"/>
-          <w:szCs w:val="48"/>
-          <w:lang w:val="en-US" w:eastAsia="ru-RU"/>
-        </w:rPr>
-        <w:t xml:space="preserve"> lol</w:t>
+        <w:t xml:space="preserve"> ЖҰМЫС </w:t>
       </w:r>
       <w:bookmarkStart w:id="0" w:name="_GoBack"/>
       <w:bookmarkEnd w:id="0"/>
@@ -15111,20 +15073,20 @@
 </file>
 
 <file path=customXml/item1.xml><?xml version="1.0" encoding="utf-8"?>
-<p:properties xmlns:p="http://schemas.microsoft.com/office/2006/metadata/properties" xmlns:xsi="http://www.w3.org/2001/XMLSchema-instance" xmlns:pc="http://schemas.microsoft.com/office/infopath/2007/PartnerControls">
-  <documentManagement>
-    <ReferenceId xmlns="ffd00d78-6a3a-430e-8dbe-b114df27fe33" xsi:nil="true"/>
-  </documentManagement>
-</p:properties>
-</file>
-
-<file path=customXml/item2.xml><?xml version="1.0" encoding="utf-8"?>
 <?mso-contentType ?>
 <FormTemplates xmlns="http://schemas.microsoft.com/sharepoint/v3/contenttype/forms">
   <Display>DocumentLibraryForm</Display>
   <Edit>DocumentLibraryForm</Edit>
   <New>DocumentLibraryForm</New>
 </FormTemplates>
+</file>
+
+<file path=customXml/item2.xml><?xml version="1.0" encoding="utf-8"?>
+<p:properties xmlns:p="http://schemas.microsoft.com/office/2006/metadata/properties" xmlns:xsi="http://www.w3.org/2001/XMLSchema-instance" xmlns:pc="http://schemas.microsoft.com/office/infopath/2007/PartnerControls">
+  <documentManagement>
+    <ReferenceId xmlns="ffd00d78-6a3a-430e-8dbe-b114df27fe33" xsi:nil="true"/>
+  </documentManagement>
+</p:properties>
 </file>
 
 <file path=customXml/item3.xml><?xml version="1.0" encoding="utf-8"?>
@@ -15272,19 +15234,19 @@
 </file>
 
 <file path=customXml/itemProps1.xml><?xml version="1.0" encoding="utf-8"?>
+<ds:datastoreItem xmlns:ds="http://schemas.openxmlformats.org/officeDocument/2006/customXml" ds:itemID="{CEA1D52B-C5E6-4211-86B6-7AEE718F29E6}">
+  <ds:schemaRefs>
+    <ds:schemaRef ds:uri="http://schemas.microsoft.com/sharepoint/v3/contenttype/forms"/>
+  </ds:schemaRefs>
+</ds:datastoreItem>
+</file>
+
+<file path=customXml/itemProps2.xml><?xml version="1.0" encoding="utf-8"?>
 <ds:datastoreItem xmlns:ds="http://schemas.openxmlformats.org/officeDocument/2006/customXml" ds:itemID="{1F0C745A-1D09-4D33-A179-FA181C0BD6A1}">
   <ds:schemaRefs>
     <ds:schemaRef ds:uri="http://schemas.microsoft.com/office/2006/metadata/properties"/>
     <ds:schemaRef ds:uri="http://schemas.microsoft.com/office/infopath/2007/PartnerControls"/>
     <ds:schemaRef ds:uri="ffd00d78-6a3a-430e-8dbe-b114df27fe33"/>
-  </ds:schemaRefs>
-</ds:datastoreItem>
-</file>
-
-<file path=customXml/itemProps2.xml><?xml version="1.0" encoding="utf-8"?>
-<ds:datastoreItem xmlns:ds="http://schemas.openxmlformats.org/officeDocument/2006/customXml" ds:itemID="{CEA1D52B-C5E6-4211-86B6-7AEE718F29E6}">
-  <ds:schemaRefs>
-    <ds:schemaRef ds:uri="http://schemas.microsoft.com/sharepoint/v3/contenttype/forms"/>
   </ds:schemaRefs>
 </ds:datastoreItem>
 </file>

</xml_diff>